<commit_message>
Align docs and set model red
</commit_message>
<xml_diff>
--- a/IAP Write Up.docx
+++ b/IAP Write Up.docx
@@ -453,6 +453,11 @@
     <w:p>
       <w:r>
         <w:tab/>
+      </w:r>
+      <w:r>
+        <w:t xml:space="preserve">With a large US pull back on foreign aid contributions in the UN and otherwise, many in the international community look to China to fill this gap. Many see it logical for China to fill this gap in influence, however traditionally China has been selective in where it allocates its ODA. </w:t>
+      </w:r>
+      <w:r>
         <w:t xml:space="preserve">This research was designed to answer if China’s foreign aid is tightly correlated to more authoritarian governments. China’s aid allocation differs from the </w:t>
       </w:r>
       <w:proofErr w:type="gramStart"/>

</xml_diff>

<commit_message>
Review recent file updates
</commit_message>
<xml_diff>
--- a/IAP Write Up.docx
+++ b/IAP Write Up.docx
@@ -501,6 +501,310 @@
       <w:r>
         <w:t xml:space="preserve"> the countries government does not have a statistically significant effect on how much aid a country receives after economic and demographic controls are accounted for.  </w:t>
       </w:r>
+    </w:p>
+    <w:p/>
+    <w:p>
+      <w:pPr>
+        <w:pStyle w:val="Heading2"/>
+      </w:pPr>
+      <w:r>
+        <w:t>Literature Review</w:t>
+      </w:r>
+    </w:p>
+    <w:p>
+      <w:pPr>
+        <w:pStyle w:val="Heading1"/>
+      </w:pPr>
+      <w:r>
+        <w:t>Theory and Hypothesis</w:t>
+      </w:r>
+    </w:p>
+    <w:p>
+      <w:r>
+        <w:t xml:space="preserve">Due to previous academic literature showcasing a larger broad preference for governments to aid governments more like theirs, our theory extends to China. Chinas unique authoritarian regime as codified by the </w:t>
+      </w:r>
+      <w:r>
+        <w:t xml:space="preserve">Our World </w:t>
+      </w:r>
+      <w:proofErr w:type="gramStart"/>
+      <w:r>
+        <w:t>In</w:t>
+      </w:r>
+      <w:proofErr w:type="gramEnd"/>
+      <w:r>
+        <w:t xml:space="preserve"> Data set allows us to test whether China does provide foreign aid to countries that share similar governance styles.</w:t>
+      </w:r>
+    </w:p>
+    <w:p/>
+    <w:p>
+      <w:pPr>
+        <w:pStyle w:val="Heading2"/>
+      </w:pPr>
+      <w:r>
+        <w:t>Hypothesis</w:t>
+      </w:r>
+    </w:p>
+    <w:p>
+      <w:r>
+        <w:rPr>
+          <w:b/>
+          <w:bCs/>
+        </w:rPr>
+        <w:t>Null Hypothesis</w:t>
+      </w:r>
+      <w:r>
+        <w:t>: There is no difference in the amount of received Aid a country gets from China based on their governance style.</w:t>
+      </w:r>
+    </w:p>
+    <w:p>
+      <w:r>
+        <w:rPr>
+          <w:b/>
+          <w:bCs/>
+        </w:rPr>
+        <w:t>Alternative</w:t>
+      </w:r>
+      <w:r>
+        <w:rPr>
+          <w:b/>
+          <w:bCs/>
+        </w:rPr>
+        <w:t xml:space="preserve"> </w:t>
+      </w:r>
+      <w:r>
+        <w:rPr>
+          <w:b/>
+          <w:bCs/>
+        </w:rPr>
+        <w:t>Hypothesis</w:t>
+      </w:r>
+      <w:r>
+        <w:t>: More authoritarian Countries Receive more Chinese Aid on average</w:t>
+      </w:r>
+    </w:p>
+    <w:p>
+      <m:oMathPara>
+        <m:oMath>
+          <m:sSub>
+            <m:sSubPr>
+              <m:ctrlPr>
+                <w:rPr>
+                  <w:rFonts w:ascii="Cambria Math" w:hAnsi="Cambria Math"/>
+                  <w:i/>
+                </w:rPr>
+              </m:ctrlPr>
+            </m:sSubPr>
+            <m:e>
+              <m:r>
+                <w:rPr>
+                  <w:rFonts w:ascii="Cambria Math" w:hAnsi="Cambria Math"/>
+                </w:rPr>
+                <m:t>H</m:t>
+              </m:r>
+            </m:e>
+            <m:sub>
+              <m:r>
+                <w:rPr>
+                  <w:rFonts w:ascii="Cambria Math" w:hAnsi="Cambria Math"/>
+                </w:rPr>
+                <m:t>0</m:t>
+              </m:r>
+            </m:sub>
+          </m:sSub>
+          <m:r>
+            <w:rPr>
+              <w:rFonts w:ascii="Cambria Math" w:hAnsi="Cambria Math"/>
+            </w:rPr>
+            <m:t>: </m:t>
+          </m:r>
+          <m:sSub>
+            <m:sSubPr>
+              <m:ctrlPr>
+                <w:rPr>
+                  <w:rFonts w:ascii="Cambria Math" w:hAnsi="Cambria Math"/>
+                  <w:i/>
+                </w:rPr>
+              </m:ctrlPr>
+            </m:sSubPr>
+            <m:e>
+              <m:r>
+                <m:rPr>
+                  <m:sty m:val="p"/>
+                </m:rPr>
+                <w:rPr>
+                  <w:rFonts w:ascii="Cambria Math" w:hAnsi="Cambria Math"/>
+                </w:rPr>
+                <m:t>μ</m:t>
+              </m:r>
+            </m:e>
+            <m:sub>
+              <m:r>
+                <w:rPr>
+                  <w:rFonts w:ascii="Cambria Math" w:hAnsi="Cambria Math"/>
+                </w:rPr>
+                <m:t>A</m:t>
+              </m:r>
+              <m:r>
+                <w:rPr>
+                  <w:rFonts w:ascii="Cambria Math" w:hAnsi="Cambria Math"/>
+                </w:rPr>
+                <m:t>uthorictarian</m:t>
+              </m:r>
+            </m:sub>
+          </m:sSub>
+          <m:r>
+            <w:rPr>
+              <w:rFonts w:ascii="Cambria Math" w:hAnsi="Cambria Math"/>
+            </w:rPr>
+            <m:t>=</m:t>
+          </m:r>
+          <m:sSub>
+            <m:sSubPr>
+              <m:ctrlPr>
+                <w:rPr>
+                  <w:rFonts w:ascii="Cambria Math" w:hAnsi="Cambria Math"/>
+                  <w:i/>
+                </w:rPr>
+              </m:ctrlPr>
+            </m:sSubPr>
+            <m:e>
+              <m:r>
+                <m:rPr>
+                  <m:sty m:val="p"/>
+                </m:rPr>
+                <w:rPr>
+                  <w:rFonts w:ascii="Cambria Math" w:hAnsi="Cambria Math"/>
+                </w:rPr>
+                <m:t>μ</m:t>
+              </m:r>
+            </m:e>
+            <m:sub>
+              <m:r>
+                <w:rPr>
+                  <w:rFonts w:ascii="Cambria Math" w:hAnsi="Cambria Math"/>
+                </w:rPr>
+                <m:t>Democratic</m:t>
+              </m:r>
+            </m:sub>
+          </m:sSub>
+          <m:r>
+            <m:rPr>
+              <m:sty m:val="p"/>
+            </m:rPr>
+            <w:rPr>
+              <w:rFonts w:ascii="Cambria Math" w:hAnsi="Cambria Math"/>
+            </w:rPr>
+            <m:t>  </m:t>
+          </m:r>
+          <m:sSub>
+            <m:sSubPr>
+              <m:ctrlPr>
+                <w:rPr>
+                  <w:rFonts w:ascii="Cambria Math" w:hAnsi="Cambria Math"/>
+                  <w:i/>
+                </w:rPr>
+              </m:ctrlPr>
+            </m:sSubPr>
+            <m:e>
+              <m:r>
+                <w:rPr>
+                  <w:rFonts w:ascii="Cambria Math" w:hAnsi="Cambria Math"/>
+                </w:rPr>
+                <m:t>H</m:t>
+              </m:r>
+              <m:ctrlPr>
+                <w:rPr>
+                  <w:rFonts w:ascii="Cambria Math" w:hAnsi="Cambria Math"/>
+                </w:rPr>
+              </m:ctrlPr>
+            </m:e>
+            <m:sub>
+              <m:r>
+                <w:rPr>
+                  <w:rFonts w:ascii="Cambria Math" w:hAnsi="Cambria Math"/>
+                </w:rPr>
+                <m:t>a</m:t>
+              </m:r>
+            </m:sub>
+          </m:sSub>
+          <m:r>
+            <w:rPr>
+              <w:rFonts w:ascii="Cambria Math" w:hAnsi="Cambria Math"/>
+            </w:rPr>
+            <m:t>: </m:t>
+          </m:r>
+          <m:sSub>
+            <m:sSubPr>
+              <m:ctrlPr>
+                <w:rPr>
+                  <w:rFonts w:ascii="Cambria Math" w:hAnsi="Cambria Math"/>
+                  <w:i/>
+                </w:rPr>
+              </m:ctrlPr>
+            </m:sSubPr>
+            <m:e>
+              <m:r>
+                <m:rPr>
+                  <m:sty m:val="p"/>
+                </m:rPr>
+                <w:rPr>
+                  <w:rFonts w:ascii="Cambria Math" w:hAnsi="Cambria Math"/>
+                </w:rPr>
+                <m:t>μ</m:t>
+              </m:r>
+            </m:e>
+            <m:sub>
+              <m:r>
+                <w:rPr>
+                  <w:rFonts w:ascii="Cambria Math" w:hAnsi="Cambria Math"/>
+                </w:rPr>
+                <m:t>A</m:t>
+              </m:r>
+              <m:r>
+                <w:rPr>
+                  <w:rFonts w:ascii="Cambria Math" w:hAnsi="Cambria Math"/>
+                </w:rPr>
+                <m:t>uthoritarian</m:t>
+              </m:r>
+            </m:sub>
+          </m:sSub>
+          <m:r>
+            <w:rPr>
+              <w:rFonts w:ascii="Cambria Math" w:hAnsi="Cambria Math"/>
+            </w:rPr>
+            <m:t>&gt;</m:t>
+          </m:r>
+          <m:sSub>
+            <m:sSubPr>
+              <m:ctrlPr>
+                <w:rPr>
+                  <w:rFonts w:ascii="Cambria Math" w:hAnsi="Cambria Math"/>
+                  <w:i/>
+                </w:rPr>
+              </m:ctrlPr>
+            </m:sSubPr>
+            <m:e>
+              <m:r>
+                <m:rPr>
+                  <m:sty m:val="p"/>
+                </m:rPr>
+                <w:rPr>
+                  <w:rFonts w:ascii="Cambria Math" w:hAnsi="Cambria Math"/>
+                </w:rPr>
+                <m:t>μ</m:t>
+              </m:r>
+            </m:e>
+            <m:sub>
+              <m:r>
+                <w:rPr>
+                  <w:rFonts w:ascii="Cambria Math" w:hAnsi="Cambria Math"/>
+                </w:rPr>
+                <m:t>Democratic</m:t>
+              </m:r>
+            </m:sub>
+          </m:sSub>
+        </m:oMath>
+      </m:oMathPara>
     </w:p>
     <w:p/>
     <w:sectPr>

</xml_diff>

<commit_message>
Update regime bar plot caption
</commit_message>
<xml_diff>
--- a/IAP Write Up.docx
+++ b/IAP Write Up.docx
@@ -8,7 +8,13 @@
         <w:jc w:val="center"/>
       </w:pPr>
       <w:r>
-        <w:t xml:space="preserve">Birds of a Feather Don’t Flock Together: </w:t>
+        <w:t xml:space="preserve">Birds of a Feather </w:t>
+      </w:r>
+      <w:r>
+        <w:t>D</w:t>
+      </w:r>
+      <w:r>
+        <w:t xml:space="preserve">on’t Flock Together: </w:t>
       </w:r>
     </w:p>
     <w:p>
@@ -37,6 +43,26 @@
       <w:pPr>
         <w:jc w:val="center"/>
       </w:pPr>
+    </w:p>
+    <w:p>
+      <w:pPr>
+        <w:jc w:val="center"/>
+      </w:pPr>
+    </w:p>
+    <w:p>
+      <w:pPr>
+        <w:jc w:val="center"/>
+      </w:pPr>
+    </w:p>
+    <w:p>
+      <w:pPr>
+        <w:jc w:val="center"/>
+      </w:pPr>
+    </w:p>
+    <w:p>
+      <w:pPr>
+        <w:jc w:val="center"/>
+      </w:pPr>
       <w:r>
         <w:t>Edgar Agunias A69046387</w:t>
       </w:r>
@@ -75,7 +101,10 @@
         <w:jc w:val="center"/>
       </w:pPr>
       <w:r>
-        <w:t>March 8</w:t>
+        <w:t xml:space="preserve">March </w:t>
+      </w:r>
+      <w:r>
+        <w:t>11</w:t>
       </w:r>
       <w:r>
         <w:rPr>
@@ -442,133 +471,131 @@
       <w:r>
         <w:fldChar w:fldCharType="end"/>
       </w:r>
+    </w:p>
+    <w:p>
+      <w:pPr>
+        <w:rPr>
+          <w:rFonts w:eastAsiaTheme="majorEastAsia"/>
+          <w:color w:val="0F4761" w:themeColor="accent1" w:themeShade="BF"/>
+          <w:sz w:val="40"/>
+          <w:szCs w:val="40"/>
+        </w:rPr>
+      </w:pPr>
       <w:r>
         <w:br w:type="page"/>
       </w:r>
+    </w:p>
+    <w:p>
       <w:r>
         <w:lastRenderedPageBreak/>
-        <w:t>Introduction</w:t>
-      </w:r>
-    </w:p>
-    <w:p>
-      <w:r>
-        <w:tab/>
-      </w:r>
-      <w:r>
-        <w:t xml:space="preserve">With a large US pull back on foreign aid contributions in the UN and otherwise, many in the international community look to China to fill this gap. Many see it logical for China to fill this gap in influence, however traditionally China has been selective in where it allocates its ODA. </w:t>
-      </w:r>
-      <w:r>
-        <w:t xml:space="preserve">This research was designed to answer if China’s foreign aid is tightly correlated to more authoritarian governments. China’s aid allocation differs from the </w:t>
-      </w:r>
-      <w:proofErr w:type="gramStart"/>
-      <w:r>
-        <w:t>US</w:t>
-      </w:r>
-      <w:proofErr w:type="gramEnd"/>
-      <w:r>
-        <w:t xml:space="preserve"> which is typically concentrated in the UN, while China’s is more direct and</w:t>
-      </w:r>
-      <w:r>
-        <w:t xml:space="preserve"> thus</w:t>
-      </w:r>
-      <w:r>
-        <w:t xml:space="preserve"> bilateral. </w:t>
-      </w:r>
-      <w:r>
-        <w:t xml:space="preserve">Chinas development finance and belt and road initiative is seen more politically motivated in the West, when compared to Western aid. Therefor the purpose of this research is to see if China’s Aid disbursement method has preference to other authoritarian governments. After extensive quantitative research using a bivariate regression analysis </w:t>
-      </w:r>
-      <w:r>
-        <w:t>there</w:t>
-      </w:r>
-      <w:r>
-        <w:t xml:space="preserve"> is a positive association</w:t>
-      </w:r>
-      <w:r>
-        <w:t>.</w:t>
-      </w:r>
-      <w:r>
-        <w:t xml:space="preserve"> </w:t>
-      </w:r>
-      <w:r>
-        <w:t>H</w:t>
-      </w:r>
-      <w:r>
-        <w:t>owever</w:t>
-      </w:r>
-      <w:r>
-        <w:t>,</w:t>
-      </w:r>
-      <w:r>
-        <w:t xml:space="preserve"> the countries government does not have a statistically significant effect on how much aid a country receives after economic and demographic controls are accounted for.  </w:t>
-      </w:r>
-    </w:p>
-    <w:p/>
-    <w:p>
-      <w:pPr>
-        <w:pStyle w:val="Heading2"/>
-      </w:pPr>
-      <w:r>
-        <w:t>Literature Review</w:t>
-      </w:r>
-    </w:p>
-    <w:p>
-      <w:pPr>
-        <w:pStyle w:val="Heading1"/>
-      </w:pPr>
-      <w:r>
-        <w:t>Theory and Hypothesis</w:t>
-      </w:r>
-    </w:p>
-    <w:p>
-      <w:r>
-        <w:t xml:space="preserve">Due to previous academic literature showcasing a larger broad preference for governments to aid governments more like theirs, our theory extends to China. Chinas unique authoritarian regime as codified by the </w:t>
-      </w:r>
-      <w:r>
-        <w:t xml:space="preserve">Our World </w:t>
-      </w:r>
-      <w:proofErr w:type="gramStart"/>
-      <w:r>
-        <w:t>In</w:t>
-      </w:r>
-      <w:proofErr w:type="gramEnd"/>
-      <w:r>
-        <w:t xml:space="preserve"> Data set allows us to test whether China does provide foreign aid to countries that share similar governance styles.</w:t>
-      </w:r>
-    </w:p>
-    <w:p/>
-    <w:p>
-      <w:pPr>
-        <w:pStyle w:val="Heading2"/>
-      </w:pPr>
-      <w:r>
-        <w:t>Hypothesis</w:t>
-      </w:r>
-    </w:p>
-    <w:p>
-      <w:r>
+        <w:t>To: Marco Rubio, Secretary of State</w:t>
+      </w:r>
+    </w:p>
+    <w:p>
+      <w:r>
+        <w:t>From: Edgar Agunias</w:t>
+      </w:r>
+    </w:p>
+    <w:p>
+      <w:r>
+        <w:t>Regarding: China’ Aid Targeting Strategy</w:t>
+      </w:r>
+    </w:p>
+    <w:p>
+      <w:r>
+        <w:t>Date: March 11</w:t>
+      </w:r>
+      <w:r>
+        <w:rPr>
+          <w:vertAlign w:val="superscript"/>
+        </w:rPr>
+        <w:t>th</w:t>
+      </w:r>
+      <w:r>
+        <w:t xml:space="preserve"> 2026</w:t>
+      </w:r>
+      <w:r>
+        <w:br/>
+      </w:r>
+    </w:p>
+    <w:p>
+      <w:pPr>
         <w:rPr>
           <w:b/>
           <w:bCs/>
         </w:rPr>
-        <w:t>Null Hypothesis</w:t>
-      </w:r>
-      <w:r>
-        <w:t>: There is no difference in the amount of received Aid a country gets from China based on their governance style.</w:t>
-      </w:r>
-    </w:p>
-    <w:p>
+      </w:pPr>
       <w:r>
         <w:rPr>
           <w:b/>
           <w:bCs/>
         </w:rPr>
-        <w:t>Alternative</w:t>
-      </w:r>
-      <w:r>
+        <w:t>Executive Summary</w:t>
+      </w:r>
+    </w:p>
+    <w:p>
+      <w:r>
+        <w:tab/>
+      </w:r>
+      <w:r>
+        <w:t xml:space="preserve">With a large US pull back on foreign aid contributions in the UN and otherwise, many in the international community look to China to fill this gap. Many see it logical for China to fill this gap in influence, however traditionally China has been selective in where it allocates its ODA. </w:t>
+      </w:r>
+      <w:r>
+        <w:t xml:space="preserve">This research was designed to answer if China’s foreign aid is tightly correlated to more authoritarian governments. China’s aid allocation differs from the </w:t>
+      </w:r>
+      <w:proofErr w:type="gramStart"/>
+      <w:r>
+        <w:t>US</w:t>
+      </w:r>
+      <w:proofErr w:type="gramEnd"/>
+      <w:r>
+        <w:t xml:space="preserve"> which is typically concentrated in the UN, while China’s is more direct and</w:t>
+      </w:r>
+      <w:r>
+        <w:t xml:space="preserve"> thus</w:t>
+      </w:r>
+      <w:r>
+        <w:t xml:space="preserve"> bilateral. </w:t>
+      </w:r>
+      <w:r>
+        <w:t xml:space="preserve">Chinas development finance and belt and road initiative is seen more politically motivated in the West, when compared to Western aid. Therefor the purpose of this research is to see if China’s Aid disbursement method has preference to other authoritarian governments. After extensive quantitative research using a bivariate regression analysis </w:t>
+      </w:r>
+      <w:r>
+        <w:t>there</w:t>
+      </w:r>
+      <w:r>
+        <w:t xml:space="preserve"> is a positive association</w:t>
+      </w:r>
+      <w:r>
+        <w:t>.</w:t>
+      </w:r>
+      <w:r>
+        <w:t xml:space="preserve"> </w:t>
+      </w:r>
+      <w:r>
+        <w:t>H</w:t>
+      </w:r>
+      <w:r>
+        <w:t>owever</w:t>
+      </w:r>
+      <w:r>
+        <w:t>,</w:t>
+      </w:r>
+      <w:r>
+        <w:t xml:space="preserve"> the countries government does not have a statistically significant effect on how much aid a country receives after economic and demographic controls are accounted for.</w:t>
+      </w:r>
+      <w:r>
+        <w:t xml:space="preserve"> </w:t>
+      </w:r>
+    </w:p>
+    <w:p>
+      <w:pPr>
         <w:rPr>
           <w:b/>
           <w:bCs/>
         </w:rPr>
+      </w:pPr>
+      <w:r>
         <w:t xml:space="preserve"> </w:t>
       </w:r>
       <w:r>
@@ -576,236 +603,11 @@
           <w:b/>
           <w:bCs/>
         </w:rPr>
-        <w:t>Hypothesis</w:t>
-      </w:r>
-      <w:r>
-        <w:t>: More authoritarian Countries Receive more Chinese Aid on average</w:t>
-      </w:r>
-    </w:p>
-    <w:p>
-      <m:oMathPara>
-        <m:oMath>
-          <m:sSub>
-            <m:sSubPr>
-              <m:ctrlPr>
-                <w:rPr>
-                  <w:rFonts w:ascii="Cambria Math" w:hAnsi="Cambria Math"/>
-                  <w:i/>
-                </w:rPr>
-              </m:ctrlPr>
-            </m:sSubPr>
-            <m:e>
-              <m:r>
-                <w:rPr>
-                  <w:rFonts w:ascii="Cambria Math" w:hAnsi="Cambria Math"/>
-                </w:rPr>
-                <m:t>H</m:t>
-              </m:r>
-            </m:e>
-            <m:sub>
-              <m:r>
-                <w:rPr>
-                  <w:rFonts w:ascii="Cambria Math" w:hAnsi="Cambria Math"/>
-                </w:rPr>
-                <m:t>0</m:t>
-              </m:r>
-            </m:sub>
-          </m:sSub>
-          <m:r>
-            <w:rPr>
-              <w:rFonts w:ascii="Cambria Math" w:hAnsi="Cambria Math"/>
-            </w:rPr>
-            <m:t>: </m:t>
-          </m:r>
-          <m:sSub>
-            <m:sSubPr>
-              <m:ctrlPr>
-                <w:rPr>
-                  <w:rFonts w:ascii="Cambria Math" w:hAnsi="Cambria Math"/>
-                  <w:i/>
-                </w:rPr>
-              </m:ctrlPr>
-            </m:sSubPr>
-            <m:e>
-              <m:r>
-                <m:rPr>
-                  <m:sty m:val="p"/>
-                </m:rPr>
-                <w:rPr>
-                  <w:rFonts w:ascii="Cambria Math" w:hAnsi="Cambria Math"/>
-                </w:rPr>
-                <m:t>μ</m:t>
-              </m:r>
-            </m:e>
-            <m:sub>
-              <m:r>
-                <w:rPr>
-                  <w:rFonts w:ascii="Cambria Math" w:hAnsi="Cambria Math"/>
-                </w:rPr>
-                <m:t>A</m:t>
-              </m:r>
-              <m:r>
-                <w:rPr>
-                  <w:rFonts w:ascii="Cambria Math" w:hAnsi="Cambria Math"/>
-                </w:rPr>
-                <m:t>uthorictarian</m:t>
-              </m:r>
-            </m:sub>
-          </m:sSub>
-          <m:r>
-            <w:rPr>
-              <w:rFonts w:ascii="Cambria Math" w:hAnsi="Cambria Math"/>
-            </w:rPr>
-            <m:t>=</m:t>
-          </m:r>
-          <m:sSub>
-            <m:sSubPr>
-              <m:ctrlPr>
-                <w:rPr>
-                  <w:rFonts w:ascii="Cambria Math" w:hAnsi="Cambria Math"/>
-                  <w:i/>
-                </w:rPr>
-              </m:ctrlPr>
-            </m:sSubPr>
-            <m:e>
-              <m:r>
-                <m:rPr>
-                  <m:sty m:val="p"/>
-                </m:rPr>
-                <w:rPr>
-                  <w:rFonts w:ascii="Cambria Math" w:hAnsi="Cambria Math"/>
-                </w:rPr>
-                <m:t>μ</m:t>
-              </m:r>
-            </m:e>
-            <m:sub>
-              <m:r>
-                <w:rPr>
-                  <w:rFonts w:ascii="Cambria Math" w:hAnsi="Cambria Math"/>
-                </w:rPr>
-                <m:t>Democratic</m:t>
-              </m:r>
-            </m:sub>
-          </m:sSub>
-          <m:r>
-            <m:rPr>
-              <m:sty m:val="p"/>
-            </m:rPr>
-            <w:rPr>
-              <w:rFonts w:ascii="Cambria Math" w:hAnsi="Cambria Math"/>
-            </w:rPr>
-            <m:t>  </m:t>
-          </m:r>
-          <m:sSub>
-            <m:sSubPr>
-              <m:ctrlPr>
-                <w:rPr>
-                  <w:rFonts w:ascii="Cambria Math" w:hAnsi="Cambria Math"/>
-                  <w:i/>
-                </w:rPr>
-              </m:ctrlPr>
-            </m:sSubPr>
-            <m:e>
-              <m:r>
-                <w:rPr>
-                  <w:rFonts w:ascii="Cambria Math" w:hAnsi="Cambria Math"/>
-                </w:rPr>
-                <m:t>H</m:t>
-              </m:r>
-              <m:ctrlPr>
-                <w:rPr>
-                  <w:rFonts w:ascii="Cambria Math" w:hAnsi="Cambria Math"/>
-                </w:rPr>
-              </m:ctrlPr>
-            </m:e>
-            <m:sub>
-              <m:r>
-                <w:rPr>
-                  <w:rFonts w:ascii="Cambria Math" w:hAnsi="Cambria Math"/>
-                </w:rPr>
-                <m:t>a</m:t>
-              </m:r>
-            </m:sub>
-          </m:sSub>
-          <m:r>
-            <w:rPr>
-              <w:rFonts w:ascii="Cambria Math" w:hAnsi="Cambria Math"/>
-            </w:rPr>
-            <m:t>: </m:t>
-          </m:r>
-          <m:sSub>
-            <m:sSubPr>
-              <m:ctrlPr>
-                <w:rPr>
-                  <w:rFonts w:ascii="Cambria Math" w:hAnsi="Cambria Math"/>
-                  <w:i/>
-                </w:rPr>
-              </m:ctrlPr>
-            </m:sSubPr>
-            <m:e>
-              <m:r>
-                <m:rPr>
-                  <m:sty m:val="p"/>
-                </m:rPr>
-                <w:rPr>
-                  <w:rFonts w:ascii="Cambria Math" w:hAnsi="Cambria Math"/>
-                </w:rPr>
-                <m:t>μ</m:t>
-              </m:r>
-            </m:e>
-            <m:sub>
-              <m:r>
-                <w:rPr>
-                  <w:rFonts w:ascii="Cambria Math" w:hAnsi="Cambria Math"/>
-                </w:rPr>
-                <m:t>A</m:t>
-              </m:r>
-              <m:r>
-                <w:rPr>
-                  <w:rFonts w:ascii="Cambria Math" w:hAnsi="Cambria Math"/>
-                </w:rPr>
-                <m:t>uthoritarian</m:t>
-              </m:r>
-            </m:sub>
-          </m:sSub>
-          <m:r>
-            <w:rPr>
-              <w:rFonts w:ascii="Cambria Math" w:hAnsi="Cambria Math"/>
-            </w:rPr>
-            <m:t>&gt;</m:t>
-          </m:r>
-          <m:sSub>
-            <m:sSubPr>
-              <m:ctrlPr>
-                <w:rPr>
-                  <w:rFonts w:ascii="Cambria Math" w:hAnsi="Cambria Math"/>
-                  <w:i/>
-                </w:rPr>
-              </m:ctrlPr>
-            </m:sSubPr>
-            <m:e>
-              <m:r>
-                <m:rPr>
-                  <m:sty m:val="p"/>
-                </m:rPr>
-                <w:rPr>
-                  <w:rFonts w:ascii="Cambria Math" w:hAnsi="Cambria Math"/>
-                </w:rPr>
-                <m:t>μ</m:t>
-              </m:r>
-            </m:e>
-            <m:sub>
-              <m:r>
-                <w:rPr>
-                  <w:rFonts w:ascii="Cambria Math" w:hAnsi="Cambria Math"/>
-                </w:rPr>
-                <m:t>Democratic</m:t>
-              </m:r>
-            </m:sub>
-          </m:sSub>
-        </m:oMath>
-      </m:oMathPara>
-    </w:p>
+        <w:t>Background:</w:t>
+      </w:r>
+    </w:p>
+    <w:p/>
+    <w:p/>
     <w:p/>
     <w:sectPr>
       <w:footerReference w:type="even" r:id="rId8"/>

</xml_diff>